<commit_message>
Attempting to resolve problems wit pyproj and shapely in Docker environment for the model run. Updated requirements. Also doc update.
</commit_message>
<xml_diff>
--- a/Documentation/Developer Architecture and Deployment Guide.docx
+++ b/Documentation/Developer Architecture and Deployment Guide.docx
@@ -1,6 +1,6 @@
 
 <file path=word/document.xml><?xml version="1.0" encoding="utf-8"?>
-<w:document xmlns:wpc="http://schemas.microsoft.com/office/word/2010/wordprocessingCanvas" xmlns:cx="http://schemas.microsoft.com/office/drawing/2014/chartex" xmlns:cx1="http://schemas.microsoft.com/office/drawing/2015/9/8/chartex" xmlns:cx2="http://schemas.microsoft.com/office/drawing/2015/10/21/chartex" xmlns:cx3="http://schemas.microsoft.com/office/drawing/2016/5/9/chartex" xmlns:cx4="http://schemas.microsoft.com/office/drawing/2016/5/10/chartex" xmlns:cx5="http://schemas.microsoft.com/office/drawing/2016/5/11/chartex" xmlns:cx6="http://schemas.microsoft.com/office/drawing/2016/5/12/chartex" xmlns:cx7="http://schemas.microsoft.com/office/drawing/2016/5/13/chartex" xmlns:cx8="http://schemas.microsoft.com/office/drawing/2016/5/14/chartex" xmlns:mc="http://schemas.openxmlformats.org/markup-compatibility/2006" xmlns:aink="http://schemas.microsoft.com/office/drawing/2016/ink" xmlns:am3d="http://schemas.microsoft.com/office/drawing/2017/model3d" xmlns:o="urn:schemas-microsoft-com:office:office" xmlns:oel="http://schemas.microsoft.com/office/2019/extlst" xmlns:r="http://schemas.openxmlformats.org/officeDocument/2006/relationships" xmlns:m="http://schemas.openxmlformats.org/officeDocument/2006/math" xmlns:v="urn:schemas-microsoft-com:vml" xmlns:wp14="http://schemas.microsoft.com/office/word/2010/wordprocessingDrawing" xmlns:wp="http://schemas.openxmlformats.org/drawingml/2006/wordprocessingDrawing" xmlns:w10="urn:schemas-microsoft-com:office:word" xmlns:w="http://schemas.openxmlformats.org/wordprocessingml/2006/main" xmlns:w14="http://schemas.microsoft.com/office/word/2010/wordml" xmlns:w15="http://schemas.microsoft.com/office/word/2012/wordml" xmlns:w16cex="http://schemas.microsoft.com/office/word/2018/wordml/cex" xmlns:w16cid="http://schemas.microsoft.com/office/word/2016/wordml/cid" xmlns:w16="http://schemas.microsoft.com/office/word/2018/wordml" xmlns:w16sdtdh="http://schemas.microsoft.com/office/word/2020/wordml/sdtdatahash" xmlns:w16se="http://schemas.microsoft.com/office/word/2015/wordml/symex" xmlns:wpg="http://schemas.microsoft.com/office/word/2010/wordprocessingGroup" xmlns:wpi="http://schemas.microsoft.com/office/word/2010/wordprocessingInk" xmlns:wne="http://schemas.microsoft.com/office/word/2006/wordml" xmlns:wps="http://schemas.microsoft.com/office/word/2010/wordprocessingShape" mc:Ignorable="w14 w15 w16se w16cid w16 w16cex w16sdtdh wp14">
+<w:document xmlns:wpc="http://schemas.microsoft.com/office/word/2010/wordprocessingCanvas" xmlns:cx="http://schemas.microsoft.com/office/drawing/2014/chartex" xmlns:cx1="http://schemas.microsoft.com/office/drawing/2015/9/8/chartex" xmlns:cx2="http://schemas.microsoft.com/office/drawing/2015/10/21/chartex" xmlns:cx3="http://schemas.microsoft.com/office/drawing/2016/5/9/chartex" xmlns:cx4="http://schemas.microsoft.com/office/drawing/2016/5/10/chartex" xmlns:cx5="http://schemas.microsoft.com/office/drawing/2016/5/11/chartex" xmlns:cx6="http://schemas.microsoft.com/office/drawing/2016/5/12/chartex" xmlns:cx7="http://schemas.microsoft.com/office/drawing/2016/5/13/chartex" xmlns:cx8="http://schemas.microsoft.com/office/drawing/2016/5/14/chartex" xmlns:mc="http://schemas.openxmlformats.org/markup-compatibility/2006" xmlns:aink="http://schemas.microsoft.com/office/drawing/2016/ink" xmlns:am3d="http://schemas.microsoft.com/office/drawing/2017/model3d" xmlns:o="urn:schemas-microsoft-com:office:office" xmlns:oel="http://schemas.microsoft.com/office/2019/extlst" xmlns:r="http://schemas.openxmlformats.org/officeDocument/2006/relationships" xmlns:m="http://schemas.openxmlformats.org/officeDocument/2006/math" xmlns:v="urn:schemas-microsoft-com:vml" xmlns:wp14="http://schemas.microsoft.com/office/word/2010/wordprocessingDrawing" xmlns:wp="http://schemas.openxmlformats.org/drawingml/2006/wordprocessingDrawing" xmlns:w10="urn:schemas-microsoft-com:office:word" xmlns:w="http://schemas.openxmlformats.org/wordprocessingml/2006/main" xmlns:w14="http://schemas.microsoft.com/office/word/2010/wordml" xmlns:w15="http://schemas.microsoft.com/office/word/2012/wordml" xmlns:w16cex="http://schemas.microsoft.com/office/word/2018/wordml/cex" xmlns:w16cid="http://schemas.microsoft.com/office/word/2016/wordml/cid" xmlns:w16="http://schemas.microsoft.com/office/word/2018/wordml" xmlns:w16du="http://schemas.microsoft.com/office/word/2023/wordml/word16du" xmlns:w16sdtdh="http://schemas.microsoft.com/office/word/2020/wordml/sdtdatahash" xmlns:w16sdtfl="http://schemas.microsoft.com/office/word/2024/wordml/sdtformatlock" xmlns:w16se="http://schemas.microsoft.com/office/word/2015/wordml/symex" xmlns:wpg="http://schemas.microsoft.com/office/word/2010/wordprocessingGroup" xmlns:wpi="http://schemas.microsoft.com/office/word/2010/wordprocessingInk" xmlns:wne="http://schemas.microsoft.com/office/word/2006/wordml" xmlns:wps="http://schemas.microsoft.com/office/word/2010/wordprocessingShape" mc:Ignorable="w14 w15 w16se w16cid w16 w16cex w16sdtdh w16sdtfl w16du wp14">
   <w:body>
     <w:p>
       <w:pPr>
@@ -979,21 +979,7 @@
                 <w:rStyle w:val="Hyperlink"/>
                 <w:noProof/>
               </w:rPr>
-              <w:t>Dockerized Model R</w:t>
-            </w:r>
-            <w:r>
-              <w:rPr>
-                <w:rStyle w:val="Hyperlink"/>
-                <w:noProof/>
-              </w:rPr>
-              <w:t>u</w:t>
-            </w:r>
-            <w:r>
-              <w:rPr>
-                <w:rStyle w:val="Hyperlink"/>
-                <w:noProof/>
-              </w:rPr>
-              <w:t>n Explanation</w:t>
+              <w:t>Dockerized Model Run Explanation</w:t>
             </w:r>
             <w:r>
               <w:rPr>
@@ -1761,6 +1747,9 @@
     <w:p/>
     <w:p>
       <w:r>
+        <w:rPr>
+          <w:noProof/>
+        </w:rPr>
         <w:drawing>
           <wp:inline distT="0" distB="0" distL="0" distR="0" wp14:anchorId="1B69DC5D" wp14:editId="1BEAE068">
             <wp:extent cx="5943600" cy="3349625"/>
@@ -1964,13 +1953,7 @@
         <w:t xml:space="preserve">The code for Docker lives in the “docker” subdirectory in the repository, located at </w:t>
       </w:r>
       <w:r>
-        <w:t>https://</w:t>
-      </w:r>
-      <w:r>
-        <w:t xml:space="preserve"> </w:t>
-      </w:r>
-      <w:r>
-        <w:t>github.com/ICF-Corp/trim-</w:t>
+        <w:t>https:// github.com/ICF-Corp/trim-</w:t>
       </w:r>
       <w:proofErr w:type="spellStart"/>
       <w:r>
@@ -1978,10 +1961,7 @@
       </w:r>
       <w:proofErr w:type="spellEnd"/>
       <w:r>
-        <w:t xml:space="preserve">. </w:t>
-      </w:r>
-      <w:r>
-        <w:t xml:space="preserve">In </w:t>
+        <w:t xml:space="preserve">. In </w:t>
       </w:r>
       <w:proofErr w:type="gramStart"/>
       <w:r>
@@ -1989,10 +1969,7 @@
       </w:r>
       <w:proofErr w:type="gramEnd"/>
       <w:r>
-        <w:t xml:space="preserve"> the deployment script can be used for updating and deploying the Docker image</w:t>
-      </w:r>
-      <w:r>
-        <w:t>, but for detail here is a roundup of the four files in this directory:</w:t>
+        <w:t xml:space="preserve"> the deployment script can be used for updating and deploying the Docker image, but for detail here is a roundup of the four files in this directory:</w:t>
       </w:r>
     </w:p>
     <w:p/>
@@ -2098,10 +2075,7 @@
       </w:r>
       <w:proofErr w:type="spellEnd"/>
       <w:r>
-        <w:t xml:space="preserve"> / Deployment Script</w:t>
-      </w:r>
-      <w:r>
-        <w:t xml:space="preserve"> Overview</w:t>
+        <w:t xml:space="preserve"> / Deployment Script Overview</w:t>
       </w:r>
       <w:bookmarkEnd w:id="5"/>
     </w:p>
@@ -3829,14 +3803,7 @@
                 <w:sz w:val="22"/>
                 <w:szCs w:val="22"/>
               </w:rPr>
-              <w:t>Password</w:t>
-            </w:r>
-            <w:r>
-              <w:rPr>
-                <w:sz w:val="22"/>
-                <w:szCs w:val="22"/>
-              </w:rPr>
-              <w:t xml:space="preserve"> for the RDS instance</w:t>
+              <w:t>Password for the RDS instance</w:t>
             </w:r>
           </w:p>
         </w:tc>
@@ -4277,6 +4244,7 @@
             <w:tcW w:w="1717" w:type="dxa"/>
           </w:tcPr>
           <w:p>
+            <w:bookmarkStart w:id="12" w:name="_Hlk199337493"/>
             <w:proofErr w:type="spellStart"/>
             <w:r>
               <w:t>push_flask_build</w:t>
@@ -4295,6 +4263,7 @@
           </w:p>
         </w:tc>
       </w:tr>
+      <w:bookmarkEnd w:id="12"/>
     </w:tbl>
     <w:p/>
     <w:p/>
@@ -4307,7 +4276,7 @@
       <w:pPr>
         <w:pStyle w:val="Heading2"/>
       </w:pPr>
-      <w:bookmarkStart w:id="12" w:name="_Toc171721462"/>
+      <w:bookmarkStart w:id="13" w:name="_Toc171721462"/>
       <w:proofErr w:type="spellStart"/>
       <w:r>
         <w:lastRenderedPageBreak/>
@@ -4320,19 +4289,19 @@
       <w:r>
         <w:t>Model Run Explanation</w:t>
       </w:r>
-      <w:bookmarkEnd w:id="12"/>
+      <w:bookmarkEnd w:id="13"/>
     </w:p>
     <w:p/>
     <w:p>
       <w:pPr>
         <w:pStyle w:val="Heading3"/>
       </w:pPr>
-      <w:bookmarkStart w:id="13" w:name="_Toc171721463"/>
+      <w:bookmarkStart w:id="14" w:name="_Toc171721463"/>
       <w:proofErr w:type="spellStart"/>
       <w:r>
         <w:t>Entrypoint</w:t>
       </w:r>
-      <w:bookmarkEnd w:id="13"/>
+      <w:bookmarkEnd w:id="14"/>
       <w:proofErr w:type="spellEnd"/>
     </w:p>
     <w:p/>
@@ -4395,7 +4364,7 @@
       <w:pPr>
         <w:pStyle w:val="Heading3"/>
       </w:pPr>
-      <w:bookmarkStart w:id="14" w:name="_Toc171721464"/>
+      <w:bookmarkStart w:id="15" w:name="_Toc171721464"/>
       <w:proofErr w:type="spellStart"/>
       <w:r>
         <w:t>Dockerized</w:t>
@@ -4404,7 +4373,7 @@
       <w:r>
         <w:t xml:space="preserve"> Flow Explanation</w:t>
       </w:r>
-      <w:bookmarkEnd w:id="14"/>
+      <w:bookmarkEnd w:id="15"/>
     </w:p>
     <w:p/>
     <w:p>
@@ -4435,6 +4404,9 @@
         <w:pStyle w:val="ListParagraph"/>
       </w:pPr>
       <w:r>
+        <w:rPr>
+          <w:noProof/>
+        </w:rPr>
         <w:drawing>
           <wp:inline distT="0" distB="0" distL="0" distR="0" wp14:anchorId="1738EA7C" wp14:editId="0A0CE3D8">
             <wp:extent cx="4443813" cy="1995443"/>
@@ -4519,6 +4491,7 @@
       <w:r>
         <w:rPr>
           <w:rFonts w:asciiTheme="majorHAnsi" w:eastAsiaTheme="majorEastAsia" w:hAnsiTheme="majorHAnsi" w:cstheme="majorBidi"/>
+          <w:noProof/>
           <w:color w:val="2F5496" w:themeColor="accent1" w:themeShade="BF"/>
           <w:sz w:val="26"/>
           <w:szCs w:val="26"/>
@@ -4628,6 +4601,7 @@
       <w:r>
         <w:rPr>
           <w:rFonts w:asciiTheme="majorHAnsi" w:eastAsiaTheme="majorEastAsia" w:hAnsiTheme="majorHAnsi" w:cstheme="majorBidi"/>
+          <w:noProof/>
           <w:color w:val="2F5496" w:themeColor="accent1" w:themeShade="BF"/>
           <w:sz w:val="26"/>
           <w:szCs w:val="26"/>
@@ -4693,6 +4667,7 @@
       <w:r>
         <w:rPr>
           <w:rFonts w:asciiTheme="majorHAnsi" w:eastAsiaTheme="majorEastAsia" w:hAnsiTheme="majorHAnsi" w:cstheme="majorBidi"/>
+          <w:noProof/>
           <w:color w:val="2F5496" w:themeColor="accent1" w:themeShade="BF"/>
           <w:sz w:val="26"/>
           <w:szCs w:val="26"/>
@@ -4765,11 +4740,11 @@
       <w:pPr>
         <w:pStyle w:val="Heading3"/>
       </w:pPr>
-      <w:bookmarkStart w:id="15" w:name="_Toc171721465"/>
+      <w:bookmarkStart w:id="16" w:name="_Toc171721465"/>
       <w:r>
         <w:t>Docker Scaling</w:t>
       </w:r>
-      <w:bookmarkEnd w:id="15"/>
+      <w:bookmarkEnd w:id="16"/>
     </w:p>
     <w:p>
       <w:pPr>
@@ -4826,14 +4801,11 @@
       <w:pPr>
         <w:pStyle w:val="Heading3"/>
       </w:pPr>
-      <w:bookmarkStart w:id="16" w:name="_Toc171721466"/>
-      <w:r>
-        <w:t xml:space="preserve">Docker </w:t>
-      </w:r>
-      <w:r>
-        <w:t>Local Testing</w:t>
-      </w:r>
-      <w:bookmarkEnd w:id="16"/>
+      <w:bookmarkStart w:id="17" w:name="_Toc171721466"/>
+      <w:r>
+        <w:t>Docker Local Testing</w:t>
+      </w:r>
+      <w:bookmarkEnd w:id="17"/>
     </w:p>
     <w:p/>
     <w:p>
@@ -4932,14 +4904,7 @@
           <w:i/>
           <w:iCs/>
         </w:rPr>
-        <w:t>` -e TASK_TOKEN_ENV_VARIABLE='IGNOREME' -e TRIM_SCENARIO_ID=</w:t>
-      </w:r>
-      <w:r>
-        <w:rPr>
-          <w:i/>
-          <w:iCs/>
-        </w:rPr>
-        <w:t>&lt;</w:t>
+        <w:t>` -e TASK_TOKEN_ENV_VARIABLE='IGNOREME' -e TRIM_SCENARIO_ID=&lt;</w:t>
       </w:r>
       <w:proofErr w:type="spellStart"/>
       <w:r>
@@ -4955,14 +4920,7 @@
           <w:i/>
           <w:iCs/>
         </w:rPr>
-        <w:t xml:space="preserve">&gt; </w:t>
-      </w:r>
-      <w:r>
-        <w:rPr>
-          <w:i/>
-          <w:iCs/>
-        </w:rPr>
-        <w:t>-e RDS_HOSTNAME=</w:t>
+        <w:t>&gt; -e RDS_HOSTNAME=</w:t>
       </w:r>
       <w:proofErr w:type="spellStart"/>
       <w:r>
@@ -5378,22 +5336,22 @@
       <w:pPr>
         <w:pStyle w:val="Heading2"/>
       </w:pPr>
-      <w:bookmarkStart w:id="17" w:name="_Toc171721467"/>
+      <w:bookmarkStart w:id="18" w:name="_Toc171721467"/>
       <w:r>
         <w:t>Troubleshooting / Logging / etc.</w:t>
       </w:r>
-      <w:bookmarkEnd w:id="17"/>
+      <w:bookmarkEnd w:id="18"/>
     </w:p>
     <w:p/>
     <w:p>
       <w:pPr>
         <w:pStyle w:val="Heading3"/>
       </w:pPr>
-      <w:bookmarkStart w:id="18" w:name="_Toc171721468"/>
+      <w:bookmarkStart w:id="19" w:name="_Toc171721468"/>
       <w:r>
         <w:t>Logs</w:t>
       </w:r>
-      <w:bookmarkEnd w:id="18"/>
+      <w:bookmarkEnd w:id="19"/>
     </w:p>
     <w:p/>
     <w:p>
@@ -5434,7 +5392,7 @@
       <w:pPr>
         <w:pStyle w:val="Heading3"/>
       </w:pPr>
-      <w:bookmarkStart w:id="19" w:name="_Toc171721469"/>
+      <w:bookmarkStart w:id="20" w:name="_Toc171721469"/>
       <w:r>
         <w:t xml:space="preserve">Accessing the </w:t>
       </w:r>
@@ -5447,7 +5405,7 @@
       <w:r>
         <w:t>s</w:t>
       </w:r>
-      <w:bookmarkEnd w:id="19"/>
+      <w:bookmarkEnd w:id="20"/>
     </w:p>
     <w:p/>
     <w:p>
@@ -5763,14 +5721,7 @@
           <w:i/>
           <w:iCs/>
         </w:rPr>
-        <w:t xml:space="preserve"> </w:t>
-      </w:r>
-      <w:r>
-        <w:rPr>
-          <w:i/>
-          <w:iCs/>
-        </w:rPr>
-        <w:t>&lt;</w:t>
+        <w:t xml:space="preserve"> &lt;</w:t>
       </w:r>
       <w:proofErr w:type="spellStart"/>
       <w:r>
@@ -5853,29 +5804,15 @@
           <w:i/>
           <w:iCs/>
         </w:rPr>
-        <w:t xml:space="preserve"> </w:t>
-      </w:r>
-      <w:r>
-        <w:rPr>
-          <w:i/>
-          <w:iCs/>
-        </w:rPr>
-        <w:t>&lt;/path/to/</w:t>
-      </w:r>
-      <w:proofErr w:type="spellStart"/>
-      <w:r>
-        <w:rPr>
-          <w:i/>
-          <w:iCs/>
-        </w:rPr>
-        <w:t>keypair</w:t>
-      </w:r>
-      <w:r>
-        <w:rPr>
-          <w:i/>
-          <w:iCs/>
-        </w:rPr>
-        <w:t>.pem</w:t>
+        <w:t xml:space="preserve"> &lt;/path/to/</w:t>
+      </w:r>
+      <w:proofErr w:type="spellStart"/>
+      <w:r>
+        <w:rPr>
+          <w:i/>
+          <w:iCs/>
+        </w:rPr>
+        <w:t>keypair.pem</w:t>
       </w:r>
       <w:proofErr w:type="spellEnd"/>
       <w:r>
@@ -5943,14 +5880,7 @@
           <w:i/>
           <w:iCs/>
         </w:rPr>
-        <w:t xml:space="preserve"> -M 20005 -N -f -L 6603:</w:t>
-      </w:r>
-      <w:r>
-        <w:rPr>
-          <w:i/>
-          <w:iCs/>
-        </w:rPr>
-        <w:t>&lt;</w:t>
+        <w:t xml:space="preserve"> -M 20005 -N -f -L 6603:&lt;</w:t>
       </w:r>
       <w:proofErr w:type="spellStart"/>
       <w:r>
@@ -5966,14 +5896,7 @@
           <w:i/>
           <w:iCs/>
         </w:rPr>
-        <w:t>&gt;</w:t>
-      </w:r>
-      <w:r>
-        <w:rPr>
-          <w:i/>
-          <w:iCs/>
-        </w:rPr>
-        <w:t xml:space="preserve">:3306 </w:t>
+        <w:t xml:space="preserve">&gt;:3306 </w:t>
       </w:r>
       <w:proofErr w:type="spellStart"/>
       <w:r>
@@ -6125,11 +6048,11 @@
       <w:pPr>
         <w:pStyle w:val="Heading2"/>
       </w:pPr>
-      <w:bookmarkStart w:id="20" w:name="_Toc171721470"/>
+      <w:bookmarkStart w:id="21" w:name="_Toc171721470"/>
       <w:r>
         <w:t>Uninstallation</w:t>
       </w:r>
-      <w:bookmarkEnd w:id="20"/>
+      <w:bookmarkEnd w:id="21"/>
     </w:p>
     <w:p/>
     <w:p>
@@ -6182,7 +6105,7 @@
 </file>
 
 <file path=word/numbering.xml><?xml version="1.0" encoding="utf-8"?>
-<w:numbering xmlns:wpc="http://schemas.microsoft.com/office/word/2010/wordprocessingCanvas" xmlns:cx="http://schemas.microsoft.com/office/drawing/2014/chartex" xmlns:cx1="http://schemas.microsoft.com/office/drawing/2015/9/8/chartex" xmlns:cx2="http://schemas.microsoft.com/office/drawing/2015/10/21/chartex" xmlns:cx3="http://schemas.microsoft.com/office/drawing/2016/5/9/chartex" xmlns:cx4="http://schemas.microsoft.com/office/drawing/2016/5/10/chartex" xmlns:cx5="http://schemas.microsoft.com/office/drawing/2016/5/11/chartex" xmlns:cx6="http://schemas.microsoft.com/office/drawing/2016/5/12/chartex" xmlns:cx7="http://schemas.microsoft.com/office/drawing/2016/5/13/chartex" xmlns:cx8="http://schemas.microsoft.com/office/drawing/2016/5/14/chartex" xmlns:mc="http://schemas.openxmlformats.org/markup-compatibility/2006" xmlns:aink="http://schemas.microsoft.com/office/drawing/2016/ink" xmlns:am3d="http://schemas.microsoft.com/office/drawing/2017/model3d" xmlns:o="urn:schemas-microsoft-com:office:office" xmlns:oel="http://schemas.microsoft.com/office/2019/extlst" xmlns:r="http://schemas.openxmlformats.org/officeDocument/2006/relationships" xmlns:m="http://schemas.openxmlformats.org/officeDocument/2006/math" xmlns:v="urn:schemas-microsoft-com:vml" xmlns:wp14="http://schemas.microsoft.com/office/word/2010/wordprocessingDrawing" xmlns:wp="http://schemas.openxmlformats.org/drawingml/2006/wordprocessingDrawing" xmlns:w10="urn:schemas-microsoft-com:office:word" xmlns:w="http://schemas.openxmlformats.org/wordprocessingml/2006/main" xmlns:w14="http://schemas.microsoft.com/office/word/2010/wordml" xmlns:w15="http://schemas.microsoft.com/office/word/2012/wordml" xmlns:w16cex="http://schemas.microsoft.com/office/word/2018/wordml/cex" xmlns:w16cid="http://schemas.microsoft.com/office/word/2016/wordml/cid" xmlns:w16="http://schemas.microsoft.com/office/word/2018/wordml" xmlns:w16sdtdh="http://schemas.microsoft.com/office/word/2020/wordml/sdtdatahash" xmlns:w16se="http://schemas.microsoft.com/office/word/2015/wordml/symex" xmlns:wpg="http://schemas.microsoft.com/office/word/2010/wordprocessingGroup" xmlns:wpi="http://schemas.microsoft.com/office/word/2010/wordprocessingInk" xmlns:wne="http://schemas.microsoft.com/office/word/2006/wordml" xmlns:wps="http://schemas.microsoft.com/office/word/2010/wordprocessingShape" mc:Ignorable="w14 w15 w16se w16cid w16 w16cex w16sdtdh wp14">
+<w:numbering xmlns:wpc="http://schemas.microsoft.com/office/word/2010/wordprocessingCanvas" xmlns:cx="http://schemas.microsoft.com/office/drawing/2014/chartex" xmlns:cx1="http://schemas.microsoft.com/office/drawing/2015/9/8/chartex" xmlns:cx2="http://schemas.microsoft.com/office/drawing/2015/10/21/chartex" xmlns:cx3="http://schemas.microsoft.com/office/drawing/2016/5/9/chartex" xmlns:cx4="http://schemas.microsoft.com/office/drawing/2016/5/10/chartex" xmlns:cx5="http://schemas.microsoft.com/office/drawing/2016/5/11/chartex" xmlns:cx6="http://schemas.microsoft.com/office/drawing/2016/5/12/chartex" xmlns:cx7="http://schemas.microsoft.com/office/drawing/2016/5/13/chartex" xmlns:cx8="http://schemas.microsoft.com/office/drawing/2016/5/14/chartex" xmlns:mc="http://schemas.openxmlformats.org/markup-compatibility/2006" xmlns:aink="http://schemas.microsoft.com/office/drawing/2016/ink" xmlns:am3d="http://schemas.microsoft.com/office/drawing/2017/model3d" xmlns:o="urn:schemas-microsoft-com:office:office" xmlns:oel="http://schemas.microsoft.com/office/2019/extlst" xmlns:r="http://schemas.openxmlformats.org/officeDocument/2006/relationships" xmlns:m="http://schemas.openxmlformats.org/officeDocument/2006/math" xmlns:v="urn:schemas-microsoft-com:vml" xmlns:wp14="http://schemas.microsoft.com/office/word/2010/wordprocessingDrawing" xmlns:wp="http://schemas.openxmlformats.org/drawingml/2006/wordprocessingDrawing" xmlns:w10="urn:schemas-microsoft-com:office:word" xmlns:w="http://schemas.openxmlformats.org/wordprocessingml/2006/main" xmlns:w14="http://schemas.microsoft.com/office/word/2010/wordml" xmlns:w15="http://schemas.microsoft.com/office/word/2012/wordml" xmlns:w16cex="http://schemas.microsoft.com/office/word/2018/wordml/cex" xmlns:w16cid="http://schemas.microsoft.com/office/word/2016/wordml/cid" xmlns:w16="http://schemas.microsoft.com/office/word/2018/wordml" xmlns:w16du="http://schemas.microsoft.com/office/word/2023/wordml/word16du" xmlns:w16sdtdh="http://schemas.microsoft.com/office/word/2020/wordml/sdtdatahash" xmlns:w16sdtfl="http://schemas.microsoft.com/office/word/2024/wordml/sdtformatlock" xmlns:w16se="http://schemas.microsoft.com/office/word/2015/wordml/symex" xmlns:wpg="http://schemas.microsoft.com/office/word/2010/wordprocessingGroup" xmlns:wpi="http://schemas.microsoft.com/office/word/2010/wordprocessingInk" xmlns:wne="http://schemas.microsoft.com/office/word/2006/wordml" xmlns:wps="http://schemas.microsoft.com/office/word/2010/wordprocessingShape" mc:Ignorable="w14 w15 w16se w16cid w16 w16cex w16sdtdh w16sdtfl w16du wp14">
   <w:abstractNum w:abstractNumId="0" w15:restartNumberingAfterBreak="0">
     <w:nsid w:val="1CB457AC"/>
     <w:multiLevelType w:val="hybridMultilevel"/>
@@ -6627,7 +6550,7 @@
 </file>
 
 <file path=word/styles.xml><?xml version="1.0" encoding="utf-8"?>
-<w:styles xmlns:mc="http://schemas.openxmlformats.org/markup-compatibility/2006" xmlns:r="http://schemas.openxmlformats.org/officeDocument/2006/relationships" xmlns:w="http://schemas.openxmlformats.org/wordprocessingml/2006/main" xmlns:w14="http://schemas.microsoft.com/office/word/2010/wordml" xmlns:w15="http://schemas.microsoft.com/office/word/2012/wordml" xmlns:w16cex="http://schemas.microsoft.com/office/word/2018/wordml/cex" xmlns:w16cid="http://schemas.microsoft.com/office/word/2016/wordml/cid" xmlns:w16="http://schemas.microsoft.com/office/word/2018/wordml" xmlns:w16sdtdh="http://schemas.microsoft.com/office/word/2020/wordml/sdtdatahash" xmlns:w16se="http://schemas.microsoft.com/office/word/2015/wordml/symex" mc:Ignorable="w14 w15 w16se w16cid w16 w16cex w16sdtdh">
+<w:styles xmlns:mc="http://schemas.openxmlformats.org/markup-compatibility/2006" xmlns:r="http://schemas.openxmlformats.org/officeDocument/2006/relationships" xmlns:w="http://schemas.openxmlformats.org/wordprocessingml/2006/main" xmlns:w14="http://schemas.microsoft.com/office/word/2010/wordml" xmlns:w15="http://schemas.microsoft.com/office/word/2012/wordml" xmlns:w16cex="http://schemas.microsoft.com/office/word/2018/wordml/cex" xmlns:w16cid="http://schemas.microsoft.com/office/word/2016/wordml/cid" xmlns:w16="http://schemas.microsoft.com/office/word/2018/wordml" xmlns:w16du="http://schemas.microsoft.com/office/word/2023/wordml/word16du" xmlns:w16sdtdh="http://schemas.microsoft.com/office/word/2020/wordml/sdtdatahash" xmlns:w16sdtfl="http://schemas.microsoft.com/office/word/2024/wordml/sdtformatlock" xmlns:w16se="http://schemas.microsoft.com/office/word/2015/wordml/symex" mc:Ignorable="w14 w15 w16se w16cid w16 w16cex w16sdtdh w16sdtfl w16du">
   <w:docDefaults>
     <w:rPrDefault>
       <w:rPr>

</xml_diff>